<commit_message>
Docx writer/reader: fix multi-paragraph list items.
Previously the docx writer gave the second and subsequent paragraphs
of a list item numbering from a separate list with an invisible
bullet.  This looked right, but semantically these paragraphs were
items of another list, which is what Word, screen readers, and
pandoc's own docx reader saw; the list was also split in three.

The writer now gives these paragraphs no numbering, just an
indentation that lines them up with the text of the list item
(as Word's "List Continue" styles do).

The docx reader now records the indentation of each list level
and tracks the open list levels; an unnumbered paragraph whose
left indentation matches the text indentation of an open level
is treated as a continuation of that level's current item,
rather than as a block quote.  So multi-paragraph list items
now round-trip through docx.

Closes #9197.

Co-Authored-By: Claude Opus 5.5 <noreply@anthropic.com>
</commit_message>
<xml_diff>
--- a/test/docx/golden/lists.docx
+++ b/test/docx/golden/lists.docx
@@ -111,10 +111,7 @@
     <w:p>
       <w:pPr>
         <w:pStyle w:val="BodyText"/>
-        <w:numPr>
-          <w:ilvl w:val="2"/>
-          <w:numId w:val="1000"/>
-        </w:numPr>
+        <w:ind w:left="2160" w:firstLine="0"/>
       </w:pPr>
       <w:r>
         <w:t xml:space="preserve">Sub paragraph</w:t>

</xml_diff>